<commit_message>
chore: MN1 highlighted the answers in the document
</commit_message>
<xml_diff>
--- a/51MN Metologija naukovyh doslidjen/1/MN_KNT-122_Onyshchenko_19_PR1.docx
+++ b/51MN Metologija naukovyh doslidjen/1/MN_KNT-122_Onyshchenko_19_PR1.docx
@@ -533,48 +533,102 @@
         <w:rPr/>
       </w:pPr>
       <w:r>
-        <w:rPr/>
-        <w:t>Тема роботи: вебзастосунок керування фермою.</w:t>
-      </w:r>
-    </w:p>
-    <w:p>
-      <w:pPr>
-        <w:pStyle w:val="p11"/>
-        <w:rPr/>
-      </w:pPr>
-      <w:r>
-        <w:rPr/>
-        <w:t>Обґрунтування вибору теми: ферми виробляють необхідні для людини ресурси, а саме їжу та напої. Для керування всіма процесами потрібно десь зберігати інформацію. Для цього має бути розроблене програмне забезпечення.</w:t>
-      </w:r>
-    </w:p>
-    <w:p>
-      <w:pPr>
-        <w:pStyle w:val="p11"/>
-        <w:rPr/>
-      </w:pPr>
-      <w:r>
-        <w:rPr/>
-        <w:t>Об’єкт: процес управління фермерським господарством.</w:t>
-      </w:r>
-    </w:p>
-    <w:p>
-      <w:pPr>
-        <w:pStyle w:val="p11"/>
-        <w:rPr/>
-      </w:pPr>
-      <w:r>
-        <w:rPr/>
-        <w:t>Предмет: методи, моделі та програмні засоби автоматизації управління фермою.</w:t>
-      </w:r>
-    </w:p>
-    <w:p>
-      <w:pPr>
-        <w:pStyle w:val="p11"/>
-        <w:rPr/>
-      </w:pPr>
-      <w:r>
-        <w:rPr/>
-        <w:t>Постановка задачі:</w:t>
+        <w:rPr>
+          <w:b/>
+          <w:bCs/>
+        </w:rPr>
+        <w:t>Тема</w:t>
+      </w:r>
+      <w:r>
+        <w:rPr/>
+        <w:t xml:space="preserve"> роботи: вебзастосунок керування фермою.</w:t>
+      </w:r>
+    </w:p>
+    <w:p>
+      <w:pPr>
+        <w:pStyle w:val="p11"/>
+        <w:rPr/>
+      </w:pPr>
+      <w:r>
+        <w:rPr>
+          <w:b/>
+          <w:bCs/>
+          <w:lang w:val="uk-UA"/>
+        </w:rPr>
+        <w:t>Актуальність</w:t>
+      </w:r>
+      <w:r>
+        <w:rPr>
+          <w:lang w:val="uk-UA"/>
+        </w:rPr>
+        <w:t xml:space="preserve"> </w:t>
+      </w:r>
+      <w:r>
+        <w:rPr/>
+        <w:t>вибр</w:t>
+      </w:r>
+      <w:r>
+        <w:rPr/>
+        <w:t xml:space="preserve">аної </w:t>
+      </w:r>
+      <w:r>
+        <w:rPr/>
+        <w:t>теми: ферми виробляють необхідні для людини ресурси, а саме їжу та напої. Для керування всіма процесами потрібно десь зберігати інформацію. Для цього має бути розроблене програмне забезпечення.</w:t>
+      </w:r>
+    </w:p>
+    <w:p>
+      <w:pPr>
+        <w:pStyle w:val="p11"/>
+        <w:rPr/>
+      </w:pPr>
+      <w:r>
+        <w:rPr>
+          <w:b/>
+          <w:bCs/>
+        </w:rPr>
+        <w:t>Предмет</w:t>
+      </w:r>
+      <w:r>
+        <w:rPr/>
+        <w:t>: методи, моделі та програмні засоби автоматизації управління фермою.</w:t>
+      </w:r>
+    </w:p>
+    <w:p>
+      <w:pPr>
+        <w:pStyle w:val="p11"/>
+        <w:rPr/>
+      </w:pPr>
+      <w:r>
+        <w:rPr>
+          <w:b/>
+          <w:bCs/>
+        </w:rPr>
+        <w:t>Об’єкт</w:t>
+      </w:r>
+      <w:r>
+        <w:rPr/>
+        <w:t>: процес управління фермерським господарством.</w:t>
+      </w:r>
+    </w:p>
+    <w:p>
+      <w:pPr>
+        <w:pStyle w:val="p11"/>
+        <w:rPr/>
+      </w:pPr>
+      <w:r>
+        <w:rPr>
+          <w:b/>
+          <w:bCs/>
+        </w:rPr>
+        <w:t xml:space="preserve">Постановка задачі </w:t>
+      </w:r>
+      <w:r>
+        <w:rPr/>
+        <w:t>дослідження</w:t>
+      </w:r>
+      <w:r>
+        <w:rPr/>
+        <w:t>:</w:t>
       </w:r>
     </w:p>
     <w:p>
@@ -1005,43 +1059,6 @@
       <w:r>
         <w:rPr/>
         <w:t>7. Формування висновків та оцінка отриманих результатів.</w:t>
-      </w:r>
-    </w:p>
-    <w:p>
-      <w:pPr>
-        <w:pStyle w:val="P1"/>
-        <w:rPr/>
-      </w:pPr>
-      <w:r>
-        <w:rPr/>
-      </w:r>
-    </w:p>
-    <w:p>
-      <w:pPr>
-        <w:pStyle w:val="H2"/>
-        <w:rPr/>
-      </w:pPr>
-      <w:r>
-        <w:rPr/>
-        <w:t>Основні вимоги щодо оформлення магістерської роботи.</w:t>
-      </w:r>
-    </w:p>
-    <w:p>
-      <w:pPr>
-        <w:pStyle w:val="P1"/>
-        <w:rPr/>
-      </w:pPr>
-      <w:r>
-        <w:rPr/>
-      </w:r>
-    </w:p>
-    <w:p>
-      <w:pPr>
-        <w:pStyle w:val="P1"/>
-        <w:rPr/>
-      </w:pPr>
-      <w:r>
-        <w:rPr/>
       </w:r>
     </w:p>
     <w:sectPr>
@@ -1842,12 +1859,12 @@
       <w:lang w:val="en-US" w:eastAsia="uk-UA"/>
     </w:rPr>
   </w:style>
-  <w:style w:type="character" w:styleId="Style12">
-    <w:name w:val="Символ нумерації"/>
+  <w:style w:type="character" w:styleId="user">
+    <w:name w:val="Символ нумерації (user)"/>
     <w:qFormat/>
     <w:rPr/>
   </w:style>
-  <w:style w:type="paragraph" w:styleId="Style13">
+  <w:style w:type="paragraph" w:styleId="Style12">
     <w:name w:val="Заголовок"/>
     <w:basedOn w:val="Normal"/>
     <w:next w:val="BodyText"/>
@@ -1857,7 +1874,7 @@
       <w:spacing w:before="240" w:after="120"/>
     </w:pPr>
     <w:rPr>
-      <w:rFonts w:ascii="Liberation Sans" w:hAnsi="Liberation Sans" w:eastAsia="Microsoft YaHei" w:cs="Lucida Sans"/>
+      <w:rFonts w:ascii="Liberation Sans" w:hAnsi="Liberation Sans" w:eastAsia="Microsoft YaHei" w:cs="Arial Unicode MS"/>
       <w:sz w:val="28"/>
       <w:szCs w:val="28"/>
     </w:rPr>
@@ -1894,7 +1911,7 @@
       <w:szCs w:val="24"/>
     </w:rPr>
   </w:style>
-  <w:style w:type="paragraph" w:styleId="Style14">
+  <w:style w:type="paragraph" w:styleId="Style13">
     <w:name w:val="Покажчик"/>
     <w:basedOn w:val="Normal"/>
     <w:qFormat/>
@@ -1902,10 +1919,10 @@
       <w:suppressLineNumbers/>
     </w:pPr>
     <w:rPr>
-      <w:rFonts w:cs="Lucida Sans"/>
-    </w:rPr>
-  </w:style>
-  <w:style w:type="paragraph" w:styleId="user">
+      <w:rFonts w:cs="Arial Unicode MS"/>
+    </w:rPr>
+  </w:style>
+  <w:style w:type="paragraph" w:styleId="user1">
     <w:name w:val="Заголовок (user)"/>
     <w:basedOn w:val="Normal"/>
     <w:next w:val="BodyText"/>
@@ -1915,12 +1932,12 @@
       <w:spacing w:before="240" w:after="120"/>
     </w:pPr>
     <w:rPr>
-      <w:rFonts w:ascii="Liberation Sans" w:hAnsi="Liberation Sans" w:eastAsia="Microsoft YaHei" w:cs="Arial Unicode MS"/>
+      <w:rFonts w:ascii="Liberation Sans" w:hAnsi="Liberation Sans" w:eastAsia="Microsoft YaHei" w:cs="Lucida Sans"/>
       <w:sz w:val="28"/>
       <w:szCs w:val="28"/>
     </w:rPr>
   </w:style>
-  <w:style w:type="paragraph" w:styleId="user1">
+  <w:style w:type="paragraph" w:styleId="user2">
     <w:name w:val="Покажчик (user)"/>
     <w:basedOn w:val="Normal"/>
     <w:qFormat/>
@@ -1928,12 +1945,12 @@
       <w:suppressLineNumbers/>
     </w:pPr>
     <w:rPr>
-      <w:rFonts w:cs="Arial Unicode MS"/>
+      <w:rFonts w:cs="Lucida Sans"/>
     </w:rPr>
   </w:style>
   <w:style w:type="paragraph" w:styleId="IndexHeading">
     <w:name w:val="index heading"/>
-    <w:basedOn w:val="user"/>
+    <w:basedOn w:val="Style12"/>
     <w:pPr/>
     <w:rPr/>
   </w:style>
@@ -2209,8 +2226,8 @@
     </w:pPr>
     <w:rPr/>
   </w:style>
-  <w:style w:type="numbering" w:styleId="user2" w:default="1">
-    <w:name w:val="Без маркерів (user)"/>
+  <w:style w:type="numbering" w:styleId="Style14" w:default="1">
+    <w:name w:val="Без маркерів"/>
     <w:uiPriority w:val="99"/>
     <w:semiHidden/>
     <w:unhideWhenUsed/>

</xml_diff>